<commit_message>
docs(prompt): them muc de trong cho thanh vien A dien prompt vao tai lieu va danh sach prompt
</commit_message>
<xml_diff>
--- a/docs/Tai_lieu_du_an.docx
+++ b/docs/Tai_lieu_du_an.docx
@@ -21660,6 +21660,1400 @@
     </w:p>
     <w:p>
       <w:pPr>
+        <w:pStyle w:val="Heading2"/>
+        <w:pageBreakBefore/>
+      </w:pPr>
+      <w:r>
+        <w:rPr>
+          <w:rFonts w:ascii="Arial" w:cs="Arial" w:eastAsia="Arial" w:hAnsi="Arial"/>
+        </w:rPr>
+        <w:t xml:space="preserve">8.6 Prompt của thành viên A (A tự điền)</w:t>
+      </w:r>
+    </w:p>
+    <w:p>
+      <w:pPr>
+        <w:pBdr>
+          <w:left w:val="single" w:color="D9A400" w:sz="18" w:space="6"/>
+        </w:pBdr>
+        <w:shd w:fill="FFF4CC" w:val="clear"/>
+        <w:spacing w:after="100" w:before="60" w:line="300"/>
+      </w:pPr>
+      <w:r>
+        <w:rPr>
+          <w:rFonts w:ascii="Arial" w:cs="Arial" w:eastAsia="Arial" w:hAnsi="Arial"/>
+          <w:b/>
+          <w:bCs/>
+          <w:sz w:val="20"/>
+          <w:szCs w:val="20"/>
+        </w:rPr>
+        <w:t xml:space="preserve">Ghi chú cho thành viên A:</w:t>
+      </w:r>
+      <w:r>
+        <w:rPr>
+          <w:rFonts w:ascii="Arial" w:cs="Arial" w:eastAsia="Arial" w:hAnsi="Arial"/>
+          <w:sz w:val="20"/>
+          <w:szCs w:val="20"/>
+        </w:rPr>
+        <w:t xml:space="preserve"> điền các prompt bạn đã dùng để AI hỗ trợ sinh code cho phần của mình (xác thực, người dùng, chi nhánh, sách và kho, thu mua sách cũ, chuyển kho, dashboard, báo cáo, trang chủ). Chép đúng nguyên văn prompt, mỗi prompt một dòng, giữ nguyên chính tả. Cột </w:t>
+      </w:r>
+      <w:r>
+        <w:rPr>
+          <w:rFonts w:ascii="Arial" w:cs="Arial" w:eastAsia="Arial" w:hAnsi="Arial"/>
+          <w:b/>
+          <w:bCs/>
+          <w:sz w:val="20"/>
+          <w:szCs w:val="20"/>
+        </w:rPr>
+        <w:t xml:space="preserve">Kết quả</w:t>
+      </w:r>
+      <w:r>
+        <w:rPr>
+          <w:rFonts w:ascii="Arial" w:cs="Arial" w:eastAsia="Arial" w:hAnsi="Arial"/>
+          <w:sz w:val="20"/>
+          <w:szCs w:val="20"/>
+        </w:rPr>
+        <w:t xml:space="preserve"> ghi AI đã làm ra gì (file, chức năng); cột </w:t>
+      </w:r>
+      <w:r>
+        <w:rPr>
+          <w:rFonts w:ascii="Arial" w:cs="Arial" w:eastAsia="Arial" w:hAnsi="Arial"/>
+          <w:b/>
+          <w:bCs/>
+          <w:sz w:val="20"/>
+          <w:szCs w:val="20"/>
+        </w:rPr>
+        <w:t xml:space="preserve">Kiểm chứng</w:t>
+      </w:r>
+      <w:r>
+        <w:rPr>
+          <w:rFonts w:ascii="Arial" w:cs="Arial" w:eastAsia="Arial" w:hAnsi="Arial"/>
+          <w:sz w:val="20"/>
+          <w:szCs w:val="20"/>
+        </w:rPr>
+        <w:t xml:space="preserve"> ghi cách bạn kiểm tra lại (chạy thử, test, đọc code). Hết dòng thì chuột phải vào bảng, chọn Insert để thêm dòng. Xoá ghi chú này sau khi điền xong. Cần ghi rõ </w:t>
+      </w:r>
+      <w:r>
+        <w:rPr>
+          <w:rFonts w:ascii="Arial" w:cs="Arial" w:eastAsia="Arial" w:hAnsi="Arial"/>
+          <w:b/>
+          <w:bCs/>
+          <w:sz w:val="20"/>
+          <w:szCs w:val="20"/>
+        </w:rPr>
+        <w:t xml:space="preserve">công cụ AI</w:t>
+      </w:r>
+      <w:r>
+        <w:rPr>
+          <w:rFonts w:ascii="Arial" w:cs="Arial" w:eastAsia="Arial" w:hAnsi="Arial"/>
+          <w:sz w:val="20"/>
+          <w:szCs w:val="20"/>
+        </w:rPr>
+        <w:t xml:space="preserve"> bạn dùng (tên và phiên bản) ở dòng dưới đây.</w:t>
+      </w:r>
+    </w:p>
+    <w:p>
+      <w:pPr>
+        <w:spacing w:after="100" w:line="300"/>
+      </w:pPr>
+      <w:r>
+        <w:rPr>
+          <w:rFonts w:ascii="Arial" w:cs="Arial" w:eastAsia="Arial" w:hAnsi="Arial"/>
+        </w:rPr>
+        <w:t xml:space="preserve">Công cụ AI thành viên A đã dùng: .......................................................................................................</w:t>
+      </w:r>
+    </w:p>
+    <w:tbl>
+      <w:tblPr>
+        <w:tblW w:type="dxa" w:w="9638"/>
+        <w:tblBorders>
+          <w:top w:val="single" w:color="auto" w:sz="4"/>
+          <w:left w:val="single" w:color="auto" w:sz="4"/>
+          <w:bottom w:val="single" w:color="auto" w:sz="4"/>
+          <w:right w:val="single" w:color="auto" w:sz="4"/>
+          <w:insideH w:val="single" w:color="auto" w:sz="4"/>
+          <w:insideV w:val="single" w:color="auto" w:sz="4"/>
+        </w:tblBorders>
+      </w:tblPr>
+      <w:tblGrid>
+        <w:gridCol w:w="500"/>
+        <w:gridCol w:w="3700"/>
+        <w:gridCol w:w="3000"/>
+        <w:gridCol w:w="2438"/>
+      </w:tblGrid>
+      <w:tr>
+        <w:trPr>
+          <w:cantSplit/>
+          <w:tblHeader/>
+        </w:trPr>
+        <w:tc>
+          <w:tcPr>
+            <w:tcW w:type="dxa" w:w="500"/>
+            <w:tcBorders>
+              <w:top w:val="single" w:color="9AA0AA" w:sz="4"/>
+              <w:left w:val="single" w:color="9AA0AA" w:sz="4"/>
+              <w:bottom w:val="single" w:color="9AA0AA" w:sz="4"/>
+              <w:right w:val="single" w:color="9AA0AA" w:sz="4"/>
+            </w:tcBorders>
+            <w:shd w:fill="E3E6EB" w:val="clear"/>
+            <w:tcMar>
+              <w:top w:type="dxa" w:w="60"/>
+              <w:left w:type="dxa" w:w="100"/>
+              <w:bottom w:type="dxa" w:w="60"/>
+              <w:right w:type="dxa" w:w="100"/>
+            </w:tcMar>
+          </w:tcPr>
+          <w:p>
+            <w:pPr>
+              <w:spacing w:after="20"/>
+            </w:pPr>
+            <w:r>
+              <w:rPr>
+                <w:rFonts w:ascii="Arial" w:cs="Arial" w:eastAsia="Arial" w:hAnsi="Arial"/>
+                <w:b/>
+                <w:bCs/>
+                <w:sz w:val="19"/>
+                <w:szCs w:val="19"/>
+              </w:rPr>
+              <w:t xml:space="preserve">#</w:t>
+            </w:r>
+          </w:p>
+        </w:tc>
+        <w:tc>
+          <w:tcPr>
+            <w:tcW w:type="dxa" w:w="3700"/>
+            <w:tcBorders>
+              <w:top w:val="single" w:color="9AA0AA" w:sz="4"/>
+              <w:left w:val="single" w:color="9AA0AA" w:sz="4"/>
+              <w:bottom w:val="single" w:color="9AA0AA" w:sz="4"/>
+              <w:right w:val="single" w:color="9AA0AA" w:sz="4"/>
+            </w:tcBorders>
+            <w:shd w:fill="E3E6EB" w:val="clear"/>
+            <w:tcMar>
+              <w:top w:type="dxa" w:w="60"/>
+              <w:left w:type="dxa" w:w="100"/>
+              <w:bottom w:type="dxa" w:w="60"/>
+              <w:right w:type="dxa" w:w="100"/>
+            </w:tcMar>
+          </w:tcPr>
+          <w:p>
+            <w:pPr>
+              <w:spacing w:after="20"/>
+            </w:pPr>
+            <w:r>
+              <w:rPr>
+                <w:rFonts w:ascii="Arial" w:cs="Arial" w:eastAsia="Arial" w:hAnsi="Arial"/>
+                <w:b/>
+                <w:bCs/>
+                <w:sz w:val="19"/>
+                <w:szCs w:val="19"/>
+              </w:rPr>
+              <w:t xml:space="preserve">Prompt</w:t>
+            </w:r>
+          </w:p>
+        </w:tc>
+        <w:tc>
+          <w:tcPr>
+            <w:tcW w:type="dxa" w:w="3000"/>
+            <w:tcBorders>
+              <w:top w:val="single" w:color="9AA0AA" w:sz="4"/>
+              <w:left w:val="single" w:color="9AA0AA" w:sz="4"/>
+              <w:bottom w:val="single" w:color="9AA0AA" w:sz="4"/>
+              <w:right w:val="single" w:color="9AA0AA" w:sz="4"/>
+            </w:tcBorders>
+            <w:shd w:fill="E3E6EB" w:val="clear"/>
+            <w:tcMar>
+              <w:top w:type="dxa" w:w="60"/>
+              <w:left w:type="dxa" w:w="100"/>
+              <w:bottom w:type="dxa" w:w="60"/>
+              <w:right w:type="dxa" w:w="100"/>
+            </w:tcMar>
+          </w:tcPr>
+          <w:p>
+            <w:pPr>
+              <w:spacing w:after="20"/>
+            </w:pPr>
+            <w:r>
+              <w:rPr>
+                <w:rFonts w:ascii="Arial" w:cs="Arial" w:eastAsia="Arial" w:hAnsi="Arial"/>
+                <w:b/>
+                <w:bCs/>
+                <w:sz w:val="19"/>
+                <w:szCs w:val="19"/>
+              </w:rPr>
+              <w:t xml:space="preserve">Kết quả</w:t>
+            </w:r>
+          </w:p>
+        </w:tc>
+        <w:tc>
+          <w:tcPr>
+            <w:tcW w:type="dxa" w:w="2438"/>
+            <w:tcBorders>
+              <w:top w:val="single" w:color="9AA0AA" w:sz="4"/>
+              <w:left w:val="single" w:color="9AA0AA" w:sz="4"/>
+              <w:bottom w:val="single" w:color="9AA0AA" w:sz="4"/>
+              <w:right w:val="single" w:color="9AA0AA" w:sz="4"/>
+            </w:tcBorders>
+            <w:shd w:fill="E3E6EB" w:val="clear"/>
+            <w:tcMar>
+              <w:top w:type="dxa" w:w="60"/>
+              <w:left w:type="dxa" w:w="100"/>
+              <w:bottom w:type="dxa" w:w="60"/>
+              <w:right w:type="dxa" w:w="100"/>
+            </w:tcMar>
+          </w:tcPr>
+          <w:p>
+            <w:pPr>
+              <w:spacing w:after="20"/>
+            </w:pPr>
+            <w:r>
+              <w:rPr>
+                <w:rFonts w:ascii="Arial" w:cs="Arial" w:eastAsia="Arial" w:hAnsi="Arial"/>
+                <w:b/>
+                <w:bCs/>
+                <w:sz w:val="19"/>
+                <w:szCs w:val="19"/>
+              </w:rPr>
+              <w:t xml:space="preserve">Kiểm chứng</w:t>
+            </w:r>
+          </w:p>
+        </w:tc>
+      </w:tr>
+      <w:tr>
+        <w:trPr>
+          <w:cantSplit/>
+          <w:trHeight w:val="700" w:hRule="atLeast"/>
+        </w:trPr>
+        <w:tc>
+          <w:tcPr>
+            <w:tcW w:type="dxa" w:w="500"/>
+            <w:tcBorders>
+              <w:top w:val="single" w:color="9AA0AA" w:sz="4"/>
+              <w:left w:val="single" w:color="9AA0AA" w:sz="4"/>
+              <w:bottom w:val="single" w:color="9AA0AA" w:sz="4"/>
+              <w:right w:val="single" w:color="9AA0AA" w:sz="4"/>
+            </w:tcBorders>
+            <w:tcMar>
+              <w:top w:type="dxa" w:w="60"/>
+              <w:left w:type="dxa" w:w="100"/>
+              <w:bottom w:type="dxa" w:w="60"/>
+              <w:right w:type="dxa" w:w="100"/>
+            </w:tcMar>
+          </w:tcPr>
+          <w:p>
+            <w:pPr>
+              <w:spacing w:after="20"/>
+            </w:pPr>
+          </w:p>
+        </w:tc>
+        <w:tc>
+          <w:tcPr>
+            <w:tcW w:type="dxa" w:w="3700"/>
+            <w:tcBorders>
+              <w:top w:val="single" w:color="9AA0AA" w:sz="4"/>
+              <w:left w:val="single" w:color="9AA0AA" w:sz="4"/>
+              <w:bottom w:val="single" w:color="9AA0AA" w:sz="4"/>
+              <w:right w:val="single" w:color="9AA0AA" w:sz="4"/>
+            </w:tcBorders>
+            <w:tcMar>
+              <w:top w:type="dxa" w:w="60"/>
+              <w:left w:type="dxa" w:w="100"/>
+              <w:bottom w:type="dxa" w:w="60"/>
+              <w:right w:type="dxa" w:w="100"/>
+            </w:tcMar>
+          </w:tcPr>
+          <w:p>
+            <w:pPr>
+              <w:spacing w:after="20"/>
+            </w:pPr>
+          </w:p>
+        </w:tc>
+        <w:tc>
+          <w:tcPr>
+            <w:tcW w:type="dxa" w:w="3000"/>
+            <w:tcBorders>
+              <w:top w:val="single" w:color="9AA0AA" w:sz="4"/>
+              <w:left w:val="single" w:color="9AA0AA" w:sz="4"/>
+              <w:bottom w:val="single" w:color="9AA0AA" w:sz="4"/>
+              <w:right w:val="single" w:color="9AA0AA" w:sz="4"/>
+            </w:tcBorders>
+            <w:tcMar>
+              <w:top w:type="dxa" w:w="60"/>
+              <w:left w:type="dxa" w:w="100"/>
+              <w:bottom w:type="dxa" w:w="60"/>
+              <w:right w:type="dxa" w:w="100"/>
+            </w:tcMar>
+          </w:tcPr>
+          <w:p>
+            <w:pPr>
+              <w:spacing w:after="20"/>
+            </w:pPr>
+          </w:p>
+        </w:tc>
+        <w:tc>
+          <w:tcPr>
+            <w:tcW w:type="dxa" w:w="2438"/>
+            <w:tcBorders>
+              <w:top w:val="single" w:color="9AA0AA" w:sz="4"/>
+              <w:left w:val="single" w:color="9AA0AA" w:sz="4"/>
+              <w:bottom w:val="single" w:color="9AA0AA" w:sz="4"/>
+              <w:right w:val="single" w:color="9AA0AA" w:sz="4"/>
+            </w:tcBorders>
+            <w:tcMar>
+              <w:top w:type="dxa" w:w="60"/>
+              <w:left w:type="dxa" w:w="100"/>
+              <w:bottom w:type="dxa" w:w="60"/>
+              <w:right w:type="dxa" w:w="100"/>
+            </w:tcMar>
+          </w:tcPr>
+          <w:p>
+            <w:pPr>
+              <w:spacing w:after="20"/>
+            </w:pPr>
+          </w:p>
+        </w:tc>
+      </w:tr>
+      <w:tr>
+        <w:trPr>
+          <w:cantSplit/>
+          <w:trHeight w:val="700" w:hRule="atLeast"/>
+        </w:trPr>
+        <w:tc>
+          <w:tcPr>
+            <w:tcW w:type="dxa" w:w="500"/>
+            <w:tcBorders>
+              <w:top w:val="single" w:color="9AA0AA" w:sz="4"/>
+              <w:left w:val="single" w:color="9AA0AA" w:sz="4"/>
+              <w:bottom w:val="single" w:color="9AA0AA" w:sz="4"/>
+              <w:right w:val="single" w:color="9AA0AA" w:sz="4"/>
+            </w:tcBorders>
+            <w:tcMar>
+              <w:top w:type="dxa" w:w="60"/>
+              <w:left w:type="dxa" w:w="100"/>
+              <w:bottom w:type="dxa" w:w="60"/>
+              <w:right w:type="dxa" w:w="100"/>
+            </w:tcMar>
+          </w:tcPr>
+          <w:p>
+            <w:pPr>
+              <w:spacing w:after="20"/>
+            </w:pPr>
+          </w:p>
+        </w:tc>
+        <w:tc>
+          <w:tcPr>
+            <w:tcW w:type="dxa" w:w="3700"/>
+            <w:tcBorders>
+              <w:top w:val="single" w:color="9AA0AA" w:sz="4"/>
+              <w:left w:val="single" w:color="9AA0AA" w:sz="4"/>
+              <w:bottom w:val="single" w:color="9AA0AA" w:sz="4"/>
+              <w:right w:val="single" w:color="9AA0AA" w:sz="4"/>
+            </w:tcBorders>
+            <w:tcMar>
+              <w:top w:type="dxa" w:w="60"/>
+              <w:left w:type="dxa" w:w="100"/>
+              <w:bottom w:type="dxa" w:w="60"/>
+              <w:right w:type="dxa" w:w="100"/>
+            </w:tcMar>
+          </w:tcPr>
+          <w:p>
+            <w:pPr>
+              <w:spacing w:after="20"/>
+            </w:pPr>
+          </w:p>
+        </w:tc>
+        <w:tc>
+          <w:tcPr>
+            <w:tcW w:type="dxa" w:w="3000"/>
+            <w:tcBorders>
+              <w:top w:val="single" w:color="9AA0AA" w:sz="4"/>
+              <w:left w:val="single" w:color="9AA0AA" w:sz="4"/>
+              <w:bottom w:val="single" w:color="9AA0AA" w:sz="4"/>
+              <w:right w:val="single" w:color="9AA0AA" w:sz="4"/>
+            </w:tcBorders>
+            <w:tcMar>
+              <w:top w:type="dxa" w:w="60"/>
+              <w:left w:type="dxa" w:w="100"/>
+              <w:bottom w:type="dxa" w:w="60"/>
+              <w:right w:type="dxa" w:w="100"/>
+            </w:tcMar>
+          </w:tcPr>
+          <w:p>
+            <w:pPr>
+              <w:spacing w:after="20"/>
+            </w:pPr>
+          </w:p>
+        </w:tc>
+        <w:tc>
+          <w:tcPr>
+            <w:tcW w:type="dxa" w:w="2438"/>
+            <w:tcBorders>
+              <w:top w:val="single" w:color="9AA0AA" w:sz="4"/>
+              <w:left w:val="single" w:color="9AA0AA" w:sz="4"/>
+              <w:bottom w:val="single" w:color="9AA0AA" w:sz="4"/>
+              <w:right w:val="single" w:color="9AA0AA" w:sz="4"/>
+            </w:tcBorders>
+            <w:tcMar>
+              <w:top w:type="dxa" w:w="60"/>
+              <w:left w:type="dxa" w:w="100"/>
+              <w:bottom w:type="dxa" w:w="60"/>
+              <w:right w:type="dxa" w:w="100"/>
+            </w:tcMar>
+          </w:tcPr>
+          <w:p>
+            <w:pPr>
+              <w:spacing w:after="20"/>
+            </w:pPr>
+          </w:p>
+        </w:tc>
+      </w:tr>
+      <w:tr>
+        <w:trPr>
+          <w:cantSplit/>
+          <w:trHeight w:val="700" w:hRule="atLeast"/>
+        </w:trPr>
+        <w:tc>
+          <w:tcPr>
+            <w:tcW w:type="dxa" w:w="500"/>
+            <w:tcBorders>
+              <w:top w:val="single" w:color="9AA0AA" w:sz="4"/>
+              <w:left w:val="single" w:color="9AA0AA" w:sz="4"/>
+              <w:bottom w:val="single" w:color="9AA0AA" w:sz="4"/>
+              <w:right w:val="single" w:color="9AA0AA" w:sz="4"/>
+            </w:tcBorders>
+            <w:tcMar>
+              <w:top w:type="dxa" w:w="60"/>
+              <w:left w:type="dxa" w:w="100"/>
+              <w:bottom w:type="dxa" w:w="60"/>
+              <w:right w:type="dxa" w:w="100"/>
+            </w:tcMar>
+          </w:tcPr>
+          <w:p>
+            <w:pPr>
+              <w:spacing w:after="20"/>
+            </w:pPr>
+          </w:p>
+        </w:tc>
+        <w:tc>
+          <w:tcPr>
+            <w:tcW w:type="dxa" w:w="3700"/>
+            <w:tcBorders>
+              <w:top w:val="single" w:color="9AA0AA" w:sz="4"/>
+              <w:left w:val="single" w:color="9AA0AA" w:sz="4"/>
+              <w:bottom w:val="single" w:color="9AA0AA" w:sz="4"/>
+              <w:right w:val="single" w:color="9AA0AA" w:sz="4"/>
+            </w:tcBorders>
+            <w:tcMar>
+              <w:top w:type="dxa" w:w="60"/>
+              <w:left w:type="dxa" w:w="100"/>
+              <w:bottom w:type="dxa" w:w="60"/>
+              <w:right w:type="dxa" w:w="100"/>
+            </w:tcMar>
+          </w:tcPr>
+          <w:p>
+            <w:pPr>
+              <w:spacing w:after="20"/>
+            </w:pPr>
+          </w:p>
+        </w:tc>
+        <w:tc>
+          <w:tcPr>
+            <w:tcW w:type="dxa" w:w="3000"/>
+            <w:tcBorders>
+              <w:top w:val="single" w:color="9AA0AA" w:sz="4"/>
+              <w:left w:val="single" w:color="9AA0AA" w:sz="4"/>
+              <w:bottom w:val="single" w:color="9AA0AA" w:sz="4"/>
+              <w:right w:val="single" w:color="9AA0AA" w:sz="4"/>
+            </w:tcBorders>
+            <w:tcMar>
+              <w:top w:type="dxa" w:w="60"/>
+              <w:left w:type="dxa" w:w="100"/>
+              <w:bottom w:type="dxa" w:w="60"/>
+              <w:right w:type="dxa" w:w="100"/>
+            </w:tcMar>
+          </w:tcPr>
+          <w:p>
+            <w:pPr>
+              <w:spacing w:after="20"/>
+            </w:pPr>
+          </w:p>
+        </w:tc>
+        <w:tc>
+          <w:tcPr>
+            <w:tcW w:type="dxa" w:w="2438"/>
+            <w:tcBorders>
+              <w:top w:val="single" w:color="9AA0AA" w:sz="4"/>
+              <w:left w:val="single" w:color="9AA0AA" w:sz="4"/>
+              <w:bottom w:val="single" w:color="9AA0AA" w:sz="4"/>
+              <w:right w:val="single" w:color="9AA0AA" w:sz="4"/>
+            </w:tcBorders>
+            <w:tcMar>
+              <w:top w:type="dxa" w:w="60"/>
+              <w:left w:type="dxa" w:w="100"/>
+              <w:bottom w:type="dxa" w:w="60"/>
+              <w:right w:type="dxa" w:w="100"/>
+            </w:tcMar>
+          </w:tcPr>
+          <w:p>
+            <w:pPr>
+              <w:spacing w:after="20"/>
+            </w:pPr>
+          </w:p>
+        </w:tc>
+      </w:tr>
+      <w:tr>
+        <w:trPr>
+          <w:cantSplit/>
+          <w:trHeight w:val="700" w:hRule="atLeast"/>
+        </w:trPr>
+        <w:tc>
+          <w:tcPr>
+            <w:tcW w:type="dxa" w:w="500"/>
+            <w:tcBorders>
+              <w:top w:val="single" w:color="9AA0AA" w:sz="4"/>
+              <w:left w:val="single" w:color="9AA0AA" w:sz="4"/>
+              <w:bottom w:val="single" w:color="9AA0AA" w:sz="4"/>
+              <w:right w:val="single" w:color="9AA0AA" w:sz="4"/>
+            </w:tcBorders>
+            <w:tcMar>
+              <w:top w:type="dxa" w:w="60"/>
+              <w:left w:type="dxa" w:w="100"/>
+              <w:bottom w:type="dxa" w:w="60"/>
+              <w:right w:type="dxa" w:w="100"/>
+            </w:tcMar>
+          </w:tcPr>
+          <w:p>
+            <w:pPr>
+              <w:spacing w:after="20"/>
+            </w:pPr>
+          </w:p>
+        </w:tc>
+        <w:tc>
+          <w:tcPr>
+            <w:tcW w:type="dxa" w:w="3700"/>
+            <w:tcBorders>
+              <w:top w:val="single" w:color="9AA0AA" w:sz="4"/>
+              <w:left w:val="single" w:color="9AA0AA" w:sz="4"/>
+              <w:bottom w:val="single" w:color="9AA0AA" w:sz="4"/>
+              <w:right w:val="single" w:color="9AA0AA" w:sz="4"/>
+            </w:tcBorders>
+            <w:tcMar>
+              <w:top w:type="dxa" w:w="60"/>
+              <w:left w:type="dxa" w:w="100"/>
+              <w:bottom w:type="dxa" w:w="60"/>
+              <w:right w:type="dxa" w:w="100"/>
+            </w:tcMar>
+          </w:tcPr>
+          <w:p>
+            <w:pPr>
+              <w:spacing w:after="20"/>
+            </w:pPr>
+          </w:p>
+        </w:tc>
+        <w:tc>
+          <w:tcPr>
+            <w:tcW w:type="dxa" w:w="3000"/>
+            <w:tcBorders>
+              <w:top w:val="single" w:color="9AA0AA" w:sz="4"/>
+              <w:left w:val="single" w:color="9AA0AA" w:sz="4"/>
+              <w:bottom w:val="single" w:color="9AA0AA" w:sz="4"/>
+              <w:right w:val="single" w:color="9AA0AA" w:sz="4"/>
+            </w:tcBorders>
+            <w:tcMar>
+              <w:top w:type="dxa" w:w="60"/>
+              <w:left w:type="dxa" w:w="100"/>
+              <w:bottom w:type="dxa" w:w="60"/>
+              <w:right w:type="dxa" w:w="100"/>
+            </w:tcMar>
+          </w:tcPr>
+          <w:p>
+            <w:pPr>
+              <w:spacing w:after="20"/>
+            </w:pPr>
+          </w:p>
+        </w:tc>
+        <w:tc>
+          <w:tcPr>
+            <w:tcW w:type="dxa" w:w="2438"/>
+            <w:tcBorders>
+              <w:top w:val="single" w:color="9AA0AA" w:sz="4"/>
+              <w:left w:val="single" w:color="9AA0AA" w:sz="4"/>
+              <w:bottom w:val="single" w:color="9AA0AA" w:sz="4"/>
+              <w:right w:val="single" w:color="9AA0AA" w:sz="4"/>
+            </w:tcBorders>
+            <w:tcMar>
+              <w:top w:type="dxa" w:w="60"/>
+              <w:left w:type="dxa" w:w="100"/>
+              <w:bottom w:type="dxa" w:w="60"/>
+              <w:right w:type="dxa" w:w="100"/>
+            </w:tcMar>
+          </w:tcPr>
+          <w:p>
+            <w:pPr>
+              <w:spacing w:after="20"/>
+            </w:pPr>
+          </w:p>
+        </w:tc>
+      </w:tr>
+      <w:tr>
+        <w:trPr>
+          <w:cantSplit/>
+          <w:trHeight w:val="700" w:hRule="atLeast"/>
+        </w:trPr>
+        <w:tc>
+          <w:tcPr>
+            <w:tcW w:type="dxa" w:w="500"/>
+            <w:tcBorders>
+              <w:top w:val="single" w:color="9AA0AA" w:sz="4"/>
+              <w:left w:val="single" w:color="9AA0AA" w:sz="4"/>
+              <w:bottom w:val="single" w:color="9AA0AA" w:sz="4"/>
+              <w:right w:val="single" w:color="9AA0AA" w:sz="4"/>
+            </w:tcBorders>
+            <w:tcMar>
+              <w:top w:type="dxa" w:w="60"/>
+              <w:left w:type="dxa" w:w="100"/>
+              <w:bottom w:type="dxa" w:w="60"/>
+              <w:right w:type="dxa" w:w="100"/>
+            </w:tcMar>
+          </w:tcPr>
+          <w:p>
+            <w:pPr>
+              <w:spacing w:after="20"/>
+            </w:pPr>
+          </w:p>
+        </w:tc>
+        <w:tc>
+          <w:tcPr>
+            <w:tcW w:type="dxa" w:w="3700"/>
+            <w:tcBorders>
+              <w:top w:val="single" w:color="9AA0AA" w:sz="4"/>
+              <w:left w:val="single" w:color="9AA0AA" w:sz="4"/>
+              <w:bottom w:val="single" w:color="9AA0AA" w:sz="4"/>
+              <w:right w:val="single" w:color="9AA0AA" w:sz="4"/>
+            </w:tcBorders>
+            <w:tcMar>
+              <w:top w:type="dxa" w:w="60"/>
+              <w:left w:type="dxa" w:w="100"/>
+              <w:bottom w:type="dxa" w:w="60"/>
+              <w:right w:type="dxa" w:w="100"/>
+            </w:tcMar>
+          </w:tcPr>
+          <w:p>
+            <w:pPr>
+              <w:spacing w:after="20"/>
+            </w:pPr>
+          </w:p>
+        </w:tc>
+        <w:tc>
+          <w:tcPr>
+            <w:tcW w:type="dxa" w:w="3000"/>
+            <w:tcBorders>
+              <w:top w:val="single" w:color="9AA0AA" w:sz="4"/>
+              <w:left w:val="single" w:color="9AA0AA" w:sz="4"/>
+              <w:bottom w:val="single" w:color="9AA0AA" w:sz="4"/>
+              <w:right w:val="single" w:color="9AA0AA" w:sz="4"/>
+            </w:tcBorders>
+            <w:tcMar>
+              <w:top w:type="dxa" w:w="60"/>
+              <w:left w:type="dxa" w:w="100"/>
+              <w:bottom w:type="dxa" w:w="60"/>
+              <w:right w:type="dxa" w:w="100"/>
+            </w:tcMar>
+          </w:tcPr>
+          <w:p>
+            <w:pPr>
+              <w:spacing w:after="20"/>
+            </w:pPr>
+          </w:p>
+        </w:tc>
+        <w:tc>
+          <w:tcPr>
+            <w:tcW w:type="dxa" w:w="2438"/>
+            <w:tcBorders>
+              <w:top w:val="single" w:color="9AA0AA" w:sz="4"/>
+              <w:left w:val="single" w:color="9AA0AA" w:sz="4"/>
+              <w:bottom w:val="single" w:color="9AA0AA" w:sz="4"/>
+              <w:right w:val="single" w:color="9AA0AA" w:sz="4"/>
+            </w:tcBorders>
+            <w:tcMar>
+              <w:top w:type="dxa" w:w="60"/>
+              <w:left w:type="dxa" w:w="100"/>
+              <w:bottom w:type="dxa" w:w="60"/>
+              <w:right w:type="dxa" w:w="100"/>
+            </w:tcMar>
+          </w:tcPr>
+          <w:p>
+            <w:pPr>
+              <w:spacing w:after="20"/>
+            </w:pPr>
+          </w:p>
+        </w:tc>
+      </w:tr>
+      <w:tr>
+        <w:trPr>
+          <w:cantSplit/>
+          <w:trHeight w:val="700" w:hRule="atLeast"/>
+        </w:trPr>
+        <w:tc>
+          <w:tcPr>
+            <w:tcW w:type="dxa" w:w="500"/>
+            <w:tcBorders>
+              <w:top w:val="single" w:color="9AA0AA" w:sz="4"/>
+              <w:left w:val="single" w:color="9AA0AA" w:sz="4"/>
+              <w:bottom w:val="single" w:color="9AA0AA" w:sz="4"/>
+              <w:right w:val="single" w:color="9AA0AA" w:sz="4"/>
+            </w:tcBorders>
+            <w:tcMar>
+              <w:top w:type="dxa" w:w="60"/>
+              <w:left w:type="dxa" w:w="100"/>
+              <w:bottom w:type="dxa" w:w="60"/>
+              <w:right w:type="dxa" w:w="100"/>
+            </w:tcMar>
+          </w:tcPr>
+          <w:p>
+            <w:pPr>
+              <w:spacing w:after="20"/>
+            </w:pPr>
+          </w:p>
+        </w:tc>
+        <w:tc>
+          <w:tcPr>
+            <w:tcW w:type="dxa" w:w="3700"/>
+            <w:tcBorders>
+              <w:top w:val="single" w:color="9AA0AA" w:sz="4"/>
+              <w:left w:val="single" w:color="9AA0AA" w:sz="4"/>
+              <w:bottom w:val="single" w:color="9AA0AA" w:sz="4"/>
+              <w:right w:val="single" w:color="9AA0AA" w:sz="4"/>
+            </w:tcBorders>
+            <w:tcMar>
+              <w:top w:type="dxa" w:w="60"/>
+              <w:left w:type="dxa" w:w="100"/>
+              <w:bottom w:type="dxa" w:w="60"/>
+              <w:right w:type="dxa" w:w="100"/>
+            </w:tcMar>
+          </w:tcPr>
+          <w:p>
+            <w:pPr>
+              <w:spacing w:after="20"/>
+            </w:pPr>
+          </w:p>
+        </w:tc>
+        <w:tc>
+          <w:tcPr>
+            <w:tcW w:type="dxa" w:w="3000"/>
+            <w:tcBorders>
+              <w:top w:val="single" w:color="9AA0AA" w:sz="4"/>
+              <w:left w:val="single" w:color="9AA0AA" w:sz="4"/>
+              <w:bottom w:val="single" w:color="9AA0AA" w:sz="4"/>
+              <w:right w:val="single" w:color="9AA0AA" w:sz="4"/>
+            </w:tcBorders>
+            <w:tcMar>
+              <w:top w:type="dxa" w:w="60"/>
+              <w:left w:type="dxa" w:w="100"/>
+              <w:bottom w:type="dxa" w:w="60"/>
+              <w:right w:type="dxa" w:w="100"/>
+            </w:tcMar>
+          </w:tcPr>
+          <w:p>
+            <w:pPr>
+              <w:spacing w:after="20"/>
+            </w:pPr>
+          </w:p>
+        </w:tc>
+        <w:tc>
+          <w:tcPr>
+            <w:tcW w:type="dxa" w:w="2438"/>
+            <w:tcBorders>
+              <w:top w:val="single" w:color="9AA0AA" w:sz="4"/>
+              <w:left w:val="single" w:color="9AA0AA" w:sz="4"/>
+              <w:bottom w:val="single" w:color="9AA0AA" w:sz="4"/>
+              <w:right w:val="single" w:color="9AA0AA" w:sz="4"/>
+            </w:tcBorders>
+            <w:tcMar>
+              <w:top w:type="dxa" w:w="60"/>
+              <w:left w:type="dxa" w:w="100"/>
+              <w:bottom w:type="dxa" w:w="60"/>
+              <w:right w:type="dxa" w:w="100"/>
+            </w:tcMar>
+          </w:tcPr>
+          <w:p>
+            <w:pPr>
+              <w:spacing w:after="20"/>
+            </w:pPr>
+          </w:p>
+        </w:tc>
+      </w:tr>
+      <w:tr>
+        <w:trPr>
+          <w:cantSplit/>
+          <w:trHeight w:val="700" w:hRule="atLeast"/>
+        </w:trPr>
+        <w:tc>
+          <w:tcPr>
+            <w:tcW w:type="dxa" w:w="500"/>
+            <w:tcBorders>
+              <w:top w:val="single" w:color="9AA0AA" w:sz="4"/>
+              <w:left w:val="single" w:color="9AA0AA" w:sz="4"/>
+              <w:bottom w:val="single" w:color="9AA0AA" w:sz="4"/>
+              <w:right w:val="single" w:color="9AA0AA" w:sz="4"/>
+            </w:tcBorders>
+            <w:tcMar>
+              <w:top w:type="dxa" w:w="60"/>
+              <w:left w:type="dxa" w:w="100"/>
+              <w:bottom w:type="dxa" w:w="60"/>
+              <w:right w:type="dxa" w:w="100"/>
+            </w:tcMar>
+          </w:tcPr>
+          <w:p>
+            <w:pPr>
+              <w:spacing w:after="20"/>
+            </w:pPr>
+          </w:p>
+        </w:tc>
+        <w:tc>
+          <w:tcPr>
+            <w:tcW w:type="dxa" w:w="3700"/>
+            <w:tcBorders>
+              <w:top w:val="single" w:color="9AA0AA" w:sz="4"/>
+              <w:left w:val="single" w:color="9AA0AA" w:sz="4"/>
+              <w:bottom w:val="single" w:color="9AA0AA" w:sz="4"/>
+              <w:right w:val="single" w:color="9AA0AA" w:sz="4"/>
+            </w:tcBorders>
+            <w:tcMar>
+              <w:top w:type="dxa" w:w="60"/>
+              <w:left w:type="dxa" w:w="100"/>
+              <w:bottom w:type="dxa" w:w="60"/>
+              <w:right w:type="dxa" w:w="100"/>
+            </w:tcMar>
+          </w:tcPr>
+          <w:p>
+            <w:pPr>
+              <w:spacing w:after="20"/>
+            </w:pPr>
+          </w:p>
+        </w:tc>
+        <w:tc>
+          <w:tcPr>
+            <w:tcW w:type="dxa" w:w="3000"/>
+            <w:tcBorders>
+              <w:top w:val="single" w:color="9AA0AA" w:sz="4"/>
+              <w:left w:val="single" w:color="9AA0AA" w:sz="4"/>
+              <w:bottom w:val="single" w:color="9AA0AA" w:sz="4"/>
+              <w:right w:val="single" w:color="9AA0AA" w:sz="4"/>
+            </w:tcBorders>
+            <w:tcMar>
+              <w:top w:type="dxa" w:w="60"/>
+              <w:left w:type="dxa" w:w="100"/>
+              <w:bottom w:type="dxa" w:w="60"/>
+              <w:right w:type="dxa" w:w="100"/>
+            </w:tcMar>
+          </w:tcPr>
+          <w:p>
+            <w:pPr>
+              <w:spacing w:after="20"/>
+            </w:pPr>
+          </w:p>
+        </w:tc>
+        <w:tc>
+          <w:tcPr>
+            <w:tcW w:type="dxa" w:w="2438"/>
+            <w:tcBorders>
+              <w:top w:val="single" w:color="9AA0AA" w:sz="4"/>
+              <w:left w:val="single" w:color="9AA0AA" w:sz="4"/>
+              <w:bottom w:val="single" w:color="9AA0AA" w:sz="4"/>
+              <w:right w:val="single" w:color="9AA0AA" w:sz="4"/>
+            </w:tcBorders>
+            <w:tcMar>
+              <w:top w:type="dxa" w:w="60"/>
+              <w:left w:type="dxa" w:w="100"/>
+              <w:bottom w:type="dxa" w:w="60"/>
+              <w:right w:type="dxa" w:w="100"/>
+            </w:tcMar>
+          </w:tcPr>
+          <w:p>
+            <w:pPr>
+              <w:spacing w:after="20"/>
+            </w:pPr>
+          </w:p>
+        </w:tc>
+      </w:tr>
+      <w:tr>
+        <w:trPr>
+          <w:cantSplit/>
+          <w:trHeight w:val="700" w:hRule="atLeast"/>
+        </w:trPr>
+        <w:tc>
+          <w:tcPr>
+            <w:tcW w:type="dxa" w:w="500"/>
+            <w:tcBorders>
+              <w:top w:val="single" w:color="9AA0AA" w:sz="4"/>
+              <w:left w:val="single" w:color="9AA0AA" w:sz="4"/>
+              <w:bottom w:val="single" w:color="9AA0AA" w:sz="4"/>
+              <w:right w:val="single" w:color="9AA0AA" w:sz="4"/>
+            </w:tcBorders>
+            <w:tcMar>
+              <w:top w:type="dxa" w:w="60"/>
+              <w:left w:type="dxa" w:w="100"/>
+              <w:bottom w:type="dxa" w:w="60"/>
+              <w:right w:type="dxa" w:w="100"/>
+            </w:tcMar>
+          </w:tcPr>
+          <w:p>
+            <w:pPr>
+              <w:spacing w:after="20"/>
+            </w:pPr>
+          </w:p>
+        </w:tc>
+        <w:tc>
+          <w:tcPr>
+            <w:tcW w:type="dxa" w:w="3700"/>
+            <w:tcBorders>
+              <w:top w:val="single" w:color="9AA0AA" w:sz="4"/>
+              <w:left w:val="single" w:color="9AA0AA" w:sz="4"/>
+              <w:bottom w:val="single" w:color="9AA0AA" w:sz="4"/>
+              <w:right w:val="single" w:color="9AA0AA" w:sz="4"/>
+            </w:tcBorders>
+            <w:tcMar>
+              <w:top w:type="dxa" w:w="60"/>
+              <w:left w:type="dxa" w:w="100"/>
+              <w:bottom w:type="dxa" w:w="60"/>
+              <w:right w:type="dxa" w:w="100"/>
+            </w:tcMar>
+          </w:tcPr>
+          <w:p>
+            <w:pPr>
+              <w:spacing w:after="20"/>
+            </w:pPr>
+          </w:p>
+        </w:tc>
+        <w:tc>
+          <w:tcPr>
+            <w:tcW w:type="dxa" w:w="3000"/>
+            <w:tcBorders>
+              <w:top w:val="single" w:color="9AA0AA" w:sz="4"/>
+              <w:left w:val="single" w:color="9AA0AA" w:sz="4"/>
+              <w:bottom w:val="single" w:color="9AA0AA" w:sz="4"/>
+              <w:right w:val="single" w:color="9AA0AA" w:sz="4"/>
+            </w:tcBorders>
+            <w:tcMar>
+              <w:top w:type="dxa" w:w="60"/>
+              <w:left w:type="dxa" w:w="100"/>
+              <w:bottom w:type="dxa" w:w="60"/>
+              <w:right w:type="dxa" w:w="100"/>
+            </w:tcMar>
+          </w:tcPr>
+          <w:p>
+            <w:pPr>
+              <w:spacing w:after="20"/>
+            </w:pPr>
+          </w:p>
+        </w:tc>
+        <w:tc>
+          <w:tcPr>
+            <w:tcW w:type="dxa" w:w="2438"/>
+            <w:tcBorders>
+              <w:top w:val="single" w:color="9AA0AA" w:sz="4"/>
+              <w:left w:val="single" w:color="9AA0AA" w:sz="4"/>
+              <w:bottom w:val="single" w:color="9AA0AA" w:sz="4"/>
+              <w:right w:val="single" w:color="9AA0AA" w:sz="4"/>
+            </w:tcBorders>
+            <w:tcMar>
+              <w:top w:type="dxa" w:w="60"/>
+              <w:left w:type="dxa" w:w="100"/>
+              <w:bottom w:type="dxa" w:w="60"/>
+              <w:right w:type="dxa" w:w="100"/>
+            </w:tcMar>
+          </w:tcPr>
+          <w:p>
+            <w:pPr>
+              <w:spacing w:after="20"/>
+            </w:pPr>
+          </w:p>
+        </w:tc>
+      </w:tr>
+      <w:tr>
+        <w:trPr>
+          <w:cantSplit/>
+          <w:trHeight w:val="700" w:hRule="atLeast"/>
+        </w:trPr>
+        <w:tc>
+          <w:tcPr>
+            <w:tcW w:type="dxa" w:w="500"/>
+            <w:tcBorders>
+              <w:top w:val="single" w:color="9AA0AA" w:sz="4"/>
+              <w:left w:val="single" w:color="9AA0AA" w:sz="4"/>
+              <w:bottom w:val="single" w:color="9AA0AA" w:sz="4"/>
+              <w:right w:val="single" w:color="9AA0AA" w:sz="4"/>
+            </w:tcBorders>
+            <w:tcMar>
+              <w:top w:type="dxa" w:w="60"/>
+              <w:left w:type="dxa" w:w="100"/>
+              <w:bottom w:type="dxa" w:w="60"/>
+              <w:right w:type="dxa" w:w="100"/>
+            </w:tcMar>
+          </w:tcPr>
+          <w:p>
+            <w:pPr>
+              <w:spacing w:after="20"/>
+            </w:pPr>
+          </w:p>
+        </w:tc>
+        <w:tc>
+          <w:tcPr>
+            <w:tcW w:type="dxa" w:w="3700"/>
+            <w:tcBorders>
+              <w:top w:val="single" w:color="9AA0AA" w:sz="4"/>
+              <w:left w:val="single" w:color="9AA0AA" w:sz="4"/>
+              <w:bottom w:val="single" w:color="9AA0AA" w:sz="4"/>
+              <w:right w:val="single" w:color="9AA0AA" w:sz="4"/>
+            </w:tcBorders>
+            <w:tcMar>
+              <w:top w:type="dxa" w:w="60"/>
+              <w:left w:type="dxa" w:w="100"/>
+              <w:bottom w:type="dxa" w:w="60"/>
+              <w:right w:type="dxa" w:w="100"/>
+            </w:tcMar>
+          </w:tcPr>
+          <w:p>
+            <w:pPr>
+              <w:spacing w:after="20"/>
+            </w:pPr>
+          </w:p>
+        </w:tc>
+        <w:tc>
+          <w:tcPr>
+            <w:tcW w:type="dxa" w:w="3000"/>
+            <w:tcBorders>
+              <w:top w:val="single" w:color="9AA0AA" w:sz="4"/>
+              <w:left w:val="single" w:color="9AA0AA" w:sz="4"/>
+              <w:bottom w:val="single" w:color="9AA0AA" w:sz="4"/>
+              <w:right w:val="single" w:color="9AA0AA" w:sz="4"/>
+            </w:tcBorders>
+            <w:tcMar>
+              <w:top w:type="dxa" w:w="60"/>
+              <w:left w:type="dxa" w:w="100"/>
+              <w:bottom w:type="dxa" w:w="60"/>
+              <w:right w:type="dxa" w:w="100"/>
+            </w:tcMar>
+          </w:tcPr>
+          <w:p>
+            <w:pPr>
+              <w:spacing w:after="20"/>
+            </w:pPr>
+          </w:p>
+        </w:tc>
+        <w:tc>
+          <w:tcPr>
+            <w:tcW w:type="dxa" w:w="2438"/>
+            <w:tcBorders>
+              <w:top w:val="single" w:color="9AA0AA" w:sz="4"/>
+              <w:left w:val="single" w:color="9AA0AA" w:sz="4"/>
+              <w:bottom w:val="single" w:color="9AA0AA" w:sz="4"/>
+              <w:right w:val="single" w:color="9AA0AA" w:sz="4"/>
+            </w:tcBorders>
+            <w:tcMar>
+              <w:top w:type="dxa" w:w="60"/>
+              <w:left w:type="dxa" w:w="100"/>
+              <w:bottom w:type="dxa" w:w="60"/>
+              <w:right w:type="dxa" w:w="100"/>
+            </w:tcMar>
+          </w:tcPr>
+          <w:p>
+            <w:pPr>
+              <w:spacing w:after="20"/>
+            </w:pPr>
+          </w:p>
+        </w:tc>
+      </w:tr>
+      <w:tr>
+        <w:trPr>
+          <w:cantSplit/>
+          <w:trHeight w:val="700" w:hRule="atLeast"/>
+        </w:trPr>
+        <w:tc>
+          <w:tcPr>
+            <w:tcW w:type="dxa" w:w="500"/>
+            <w:tcBorders>
+              <w:top w:val="single" w:color="9AA0AA" w:sz="4"/>
+              <w:left w:val="single" w:color="9AA0AA" w:sz="4"/>
+              <w:bottom w:val="single" w:color="9AA0AA" w:sz="4"/>
+              <w:right w:val="single" w:color="9AA0AA" w:sz="4"/>
+            </w:tcBorders>
+            <w:tcMar>
+              <w:top w:type="dxa" w:w="60"/>
+              <w:left w:type="dxa" w:w="100"/>
+              <w:bottom w:type="dxa" w:w="60"/>
+              <w:right w:type="dxa" w:w="100"/>
+            </w:tcMar>
+          </w:tcPr>
+          <w:p>
+            <w:pPr>
+              <w:spacing w:after="20"/>
+            </w:pPr>
+          </w:p>
+        </w:tc>
+        <w:tc>
+          <w:tcPr>
+            <w:tcW w:type="dxa" w:w="3700"/>
+            <w:tcBorders>
+              <w:top w:val="single" w:color="9AA0AA" w:sz="4"/>
+              <w:left w:val="single" w:color="9AA0AA" w:sz="4"/>
+              <w:bottom w:val="single" w:color="9AA0AA" w:sz="4"/>
+              <w:right w:val="single" w:color="9AA0AA" w:sz="4"/>
+            </w:tcBorders>
+            <w:tcMar>
+              <w:top w:type="dxa" w:w="60"/>
+              <w:left w:type="dxa" w:w="100"/>
+              <w:bottom w:type="dxa" w:w="60"/>
+              <w:right w:type="dxa" w:w="100"/>
+            </w:tcMar>
+          </w:tcPr>
+          <w:p>
+            <w:pPr>
+              <w:spacing w:after="20"/>
+            </w:pPr>
+          </w:p>
+        </w:tc>
+        <w:tc>
+          <w:tcPr>
+            <w:tcW w:type="dxa" w:w="3000"/>
+            <w:tcBorders>
+              <w:top w:val="single" w:color="9AA0AA" w:sz="4"/>
+              <w:left w:val="single" w:color="9AA0AA" w:sz="4"/>
+              <w:bottom w:val="single" w:color="9AA0AA" w:sz="4"/>
+              <w:right w:val="single" w:color="9AA0AA" w:sz="4"/>
+            </w:tcBorders>
+            <w:tcMar>
+              <w:top w:type="dxa" w:w="60"/>
+              <w:left w:type="dxa" w:w="100"/>
+              <w:bottom w:type="dxa" w:w="60"/>
+              <w:right w:type="dxa" w:w="100"/>
+            </w:tcMar>
+          </w:tcPr>
+          <w:p>
+            <w:pPr>
+              <w:spacing w:after="20"/>
+            </w:pPr>
+          </w:p>
+        </w:tc>
+        <w:tc>
+          <w:tcPr>
+            <w:tcW w:type="dxa" w:w="2438"/>
+            <w:tcBorders>
+              <w:top w:val="single" w:color="9AA0AA" w:sz="4"/>
+              <w:left w:val="single" w:color="9AA0AA" w:sz="4"/>
+              <w:bottom w:val="single" w:color="9AA0AA" w:sz="4"/>
+              <w:right w:val="single" w:color="9AA0AA" w:sz="4"/>
+            </w:tcBorders>
+            <w:tcMar>
+              <w:top w:type="dxa" w:w="60"/>
+              <w:left w:type="dxa" w:w="100"/>
+              <w:bottom w:type="dxa" w:w="60"/>
+              <w:right w:type="dxa" w:w="100"/>
+            </w:tcMar>
+          </w:tcPr>
+          <w:p>
+            <w:pPr>
+              <w:spacing w:after="20"/>
+            </w:pPr>
+          </w:p>
+        </w:tc>
+      </w:tr>
+      <w:tr>
+        <w:trPr>
+          <w:cantSplit/>
+          <w:trHeight w:val="700" w:hRule="atLeast"/>
+        </w:trPr>
+        <w:tc>
+          <w:tcPr>
+            <w:tcW w:type="dxa" w:w="500"/>
+            <w:tcBorders>
+              <w:top w:val="single" w:color="9AA0AA" w:sz="4"/>
+              <w:left w:val="single" w:color="9AA0AA" w:sz="4"/>
+              <w:bottom w:val="single" w:color="9AA0AA" w:sz="4"/>
+              <w:right w:val="single" w:color="9AA0AA" w:sz="4"/>
+            </w:tcBorders>
+            <w:tcMar>
+              <w:top w:type="dxa" w:w="60"/>
+              <w:left w:type="dxa" w:w="100"/>
+              <w:bottom w:type="dxa" w:w="60"/>
+              <w:right w:type="dxa" w:w="100"/>
+            </w:tcMar>
+          </w:tcPr>
+          <w:p>
+            <w:pPr>
+              <w:spacing w:after="20"/>
+            </w:pPr>
+          </w:p>
+        </w:tc>
+        <w:tc>
+          <w:tcPr>
+            <w:tcW w:type="dxa" w:w="3700"/>
+            <w:tcBorders>
+              <w:top w:val="single" w:color="9AA0AA" w:sz="4"/>
+              <w:left w:val="single" w:color="9AA0AA" w:sz="4"/>
+              <w:bottom w:val="single" w:color="9AA0AA" w:sz="4"/>
+              <w:right w:val="single" w:color="9AA0AA" w:sz="4"/>
+            </w:tcBorders>
+            <w:tcMar>
+              <w:top w:type="dxa" w:w="60"/>
+              <w:left w:type="dxa" w:w="100"/>
+              <w:bottom w:type="dxa" w:w="60"/>
+              <w:right w:type="dxa" w:w="100"/>
+            </w:tcMar>
+          </w:tcPr>
+          <w:p>
+            <w:pPr>
+              <w:spacing w:after="20"/>
+            </w:pPr>
+          </w:p>
+        </w:tc>
+        <w:tc>
+          <w:tcPr>
+            <w:tcW w:type="dxa" w:w="3000"/>
+            <w:tcBorders>
+              <w:top w:val="single" w:color="9AA0AA" w:sz="4"/>
+              <w:left w:val="single" w:color="9AA0AA" w:sz="4"/>
+              <w:bottom w:val="single" w:color="9AA0AA" w:sz="4"/>
+              <w:right w:val="single" w:color="9AA0AA" w:sz="4"/>
+            </w:tcBorders>
+            <w:tcMar>
+              <w:top w:type="dxa" w:w="60"/>
+              <w:left w:type="dxa" w:w="100"/>
+              <w:bottom w:type="dxa" w:w="60"/>
+              <w:right w:type="dxa" w:w="100"/>
+            </w:tcMar>
+          </w:tcPr>
+          <w:p>
+            <w:pPr>
+              <w:spacing w:after="20"/>
+            </w:pPr>
+          </w:p>
+        </w:tc>
+        <w:tc>
+          <w:tcPr>
+            <w:tcW w:type="dxa" w:w="2438"/>
+            <w:tcBorders>
+              <w:top w:val="single" w:color="9AA0AA" w:sz="4"/>
+              <w:left w:val="single" w:color="9AA0AA" w:sz="4"/>
+              <w:bottom w:val="single" w:color="9AA0AA" w:sz="4"/>
+              <w:right w:val="single" w:color="9AA0AA" w:sz="4"/>
+            </w:tcBorders>
+            <w:tcMar>
+              <w:top w:type="dxa" w:w="60"/>
+              <w:left w:type="dxa" w:w="100"/>
+              <w:bottom w:type="dxa" w:w="60"/>
+              <w:right w:type="dxa" w:w="100"/>
+            </w:tcMar>
+          </w:tcPr>
+          <w:p>
+            <w:pPr>
+              <w:spacing w:after="20"/>
+            </w:pPr>
+          </w:p>
+        </w:tc>
+      </w:tr>
+      <w:tr>
+        <w:trPr>
+          <w:cantSplit/>
+          <w:trHeight w:val="700" w:hRule="atLeast"/>
+        </w:trPr>
+        <w:tc>
+          <w:tcPr>
+            <w:tcW w:type="dxa" w:w="500"/>
+            <w:tcBorders>
+              <w:top w:val="single" w:color="9AA0AA" w:sz="4"/>
+              <w:left w:val="single" w:color="9AA0AA" w:sz="4"/>
+              <w:bottom w:val="single" w:color="9AA0AA" w:sz="4"/>
+              <w:right w:val="single" w:color="9AA0AA" w:sz="4"/>
+            </w:tcBorders>
+            <w:tcMar>
+              <w:top w:type="dxa" w:w="60"/>
+              <w:left w:type="dxa" w:w="100"/>
+              <w:bottom w:type="dxa" w:w="60"/>
+              <w:right w:type="dxa" w:w="100"/>
+            </w:tcMar>
+          </w:tcPr>
+          <w:p>
+            <w:pPr>
+              <w:spacing w:after="20"/>
+            </w:pPr>
+          </w:p>
+        </w:tc>
+        <w:tc>
+          <w:tcPr>
+            <w:tcW w:type="dxa" w:w="3700"/>
+            <w:tcBorders>
+              <w:top w:val="single" w:color="9AA0AA" w:sz="4"/>
+              <w:left w:val="single" w:color="9AA0AA" w:sz="4"/>
+              <w:bottom w:val="single" w:color="9AA0AA" w:sz="4"/>
+              <w:right w:val="single" w:color="9AA0AA" w:sz="4"/>
+            </w:tcBorders>
+            <w:tcMar>
+              <w:top w:type="dxa" w:w="60"/>
+              <w:left w:type="dxa" w:w="100"/>
+              <w:bottom w:type="dxa" w:w="60"/>
+              <w:right w:type="dxa" w:w="100"/>
+            </w:tcMar>
+          </w:tcPr>
+          <w:p>
+            <w:pPr>
+              <w:spacing w:after="20"/>
+            </w:pPr>
+          </w:p>
+        </w:tc>
+        <w:tc>
+          <w:tcPr>
+            <w:tcW w:type="dxa" w:w="3000"/>
+            <w:tcBorders>
+              <w:top w:val="single" w:color="9AA0AA" w:sz="4"/>
+              <w:left w:val="single" w:color="9AA0AA" w:sz="4"/>
+              <w:bottom w:val="single" w:color="9AA0AA" w:sz="4"/>
+              <w:right w:val="single" w:color="9AA0AA" w:sz="4"/>
+            </w:tcBorders>
+            <w:tcMar>
+              <w:top w:type="dxa" w:w="60"/>
+              <w:left w:type="dxa" w:w="100"/>
+              <w:bottom w:type="dxa" w:w="60"/>
+              <w:right w:type="dxa" w:w="100"/>
+            </w:tcMar>
+          </w:tcPr>
+          <w:p>
+            <w:pPr>
+              <w:spacing w:after="20"/>
+            </w:pPr>
+          </w:p>
+        </w:tc>
+        <w:tc>
+          <w:tcPr>
+            <w:tcW w:type="dxa" w:w="2438"/>
+            <w:tcBorders>
+              <w:top w:val="single" w:color="9AA0AA" w:sz="4"/>
+              <w:left w:val="single" w:color="9AA0AA" w:sz="4"/>
+              <w:bottom w:val="single" w:color="9AA0AA" w:sz="4"/>
+              <w:right w:val="single" w:color="9AA0AA" w:sz="4"/>
+            </w:tcBorders>
+            <w:tcMar>
+              <w:top w:type="dxa" w:w="60"/>
+              <w:left w:type="dxa" w:w="100"/>
+              <w:bottom w:type="dxa" w:w="60"/>
+              <w:right w:type="dxa" w:w="100"/>
+            </w:tcMar>
+          </w:tcPr>
+          <w:p>
+            <w:pPr>
+              <w:spacing w:after="20"/>
+            </w:pPr>
+          </w:p>
+        </w:tc>
+      </w:tr>
+    </w:tbl>
+    <w:p>
+      <w:pPr>
+        <w:spacing w:after="100"/>
+      </w:pPr>
+    </w:p>
+    <w:p>
+      <w:pPr>
         <w:spacing w:after="100" w:line="300"/>
       </w:pPr>
       <w:r>
@@ -21680,7 +23074,7 @@
         <w:rPr>
           <w:rFonts w:ascii="Arial" w:cs="Arial" w:eastAsia="Arial" w:hAnsi="Arial"/>
         </w:rPr>
-        <w:t xml:space="preserve"> trong kho mã nguồn. Phần này ghi prompt của thành viên B; thành viên A bổ sung prompt của mình theo cùng mẫu.</w:t>
+        <w:t xml:space="preserve"> trong kho mã nguồn. Mục 8.1 đến 8.5 là prompt của thành viên B; mục 8.6 để thành viên A điền prompt của mình theo cùng mẫu.</w:t>
       </w:r>
     </w:p>
     <w:p>

</xml_diff>